<commit_message>
Entrega de la practica 3
</commit_message>
<xml_diff>
--- a/practica03/doc/resumen.docx
+++ b/practica03/doc/resumen.docx
@@ -27,16 +27,16 @@
         <w:tblLook w:val="0600"/>
       </w:tblPr>
       <w:tblGrid>
-        <w:gridCol w:w="1274"/>
+        <w:gridCol w:w="1273"/>
         <w:gridCol w:w="3330"/>
         <w:gridCol w:w="1320"/>
-        <w:gridCol w:w="3091"/>
+        <w:gridCol w:w="3092"/>
       </w:tblGrid>
       <w:tr>
         <w:trPr/>
         <w:tc>
           <w:tcPr>
-            <w:tcW w:w="1274" w:type="dxa"/>
+            <w:tcW w:w="1273" w:type="dxa"/>
             <w:tcBorders>
               <w:top w:val="single" w:sz="8" w:space="0" w:color="FFFFFF"/>
               <w:start w:val="single" w:sz="8" w:space="0" w:color="FFFFFF"/>
@@ -51,7 +51,6 @@
               <w:keepNext w:val="false"/>
               <w:keepLines w:val="false"/>
               <w:widowControl w:val="false"/>
-              <w:pBdr/>
               <w:shd w:val="clear" w:fill="auto"/>
               <w:spacing w:lineRule="auto" w:line="240" w:before="0" w:after="0"/>
               <w:ind w:hanging="0" w:start="0" w:end="0"/>
@@ -93,7 +92,6 @@
               <w:keepNext w:val="false"/>
               <w:keepLines w:val="false"/>
               <w:widowControl w:val="false"/>
-              <w:pBdr/>
               <w:shd w:val="clear" w:fill="auto"/>
               <w:spacing w:lineRule="auto" w:line="240" w:before="0" w:after="0"/>
               <w:ind w:hanging="0" w:start="0" w:end="0"/>
@@ -131,7 +129,6 @@
               <w:keepNext w:val="false"/>
               <w:keepLines w:val="false"/>
               <w:widowControl w:val="false"/>
-              <w:pBdr/>
               <w:shd w:val="clear" w:fill="auto"/>
               <w:spacing w:lineRule="auto" w:line="240" w:before="0" w:after="0"/>
               <w:ind w:hanging="0" w:start="0" w:end="0"/>
@@ -158,7 +155,7 @@
         </w:tc>
         <w:tc>
           <w:tcPr>
-            <w:tcW w:w="3091" w:type="dxa"/>
+            <w:tcW w:w="3092" w:type="dxa"/>
             <w:tcBorders>
               <w:top w:val="single" w:sz="8" w:space="0" w:color="FFFFFF"/>
               <w:start w:val="single" w:sz="8" w:space="0" w:color="FFFFFF"/>
@@ -173,7 +170,6 @@
               <w:keepNext w:val="false"/>
               <w:keepLines w:val="false"/>
               <w:widowControl w:val="false"/>
-              <w:pBdr/>
               <w:shd w:val="clear" w:fill="auto"/>
               <w:spacing w:lineRule="auto" w:line="240" w:before="0" w:after="0"/>
               <w:ind w:hanging="0" w:start="0" w:end="0"/>
@@ -199,7 +195,7 @@
         <w:trPr/>
         <w:tc>
           <w:tcPr>
-            <w:tcW w:w="1274" w:type="dxa"/>
+            <w:tcW w:w="1273" w:type="dxa"/>
             <w:tcBorders>
               <w:top w:val="single" w:sz="8" w:space="0" w:color="FFFFFF"/>
               <w:start w:val="single" w:sz="8" w:space="0" w:color="FFFFFF"/>
@@ -214,7 +210,6 @@
               <w:keepNext w:val="false"/>
               <w:keepLines w:val="false"/>
               <w:widowControl w:val="false"/>
-              <w:pBdr/>
               <w:shd w:val="clear" w:fill="auto"/>
               <w:spacing w:lineRule="auto" w:line="240" w:before="0" w:after="0"/>
               <w:ind w:hanging="0" w:start="0" w:end="0"/>
@@ -256,7 +251,6 @@
               <w:keepNext w:val="false"/>
               <w:keepLines w:val="false"/>
               <w:widowControl w:val="false"/>
-              <w:pBdr/>
               <w:shd w:val="clear" w:fill="auto"/>
               <w:spacing w:lineRule="auto" w:line="240" w:before="0" w:after="0"/>
               <w:ind w:hanging="0" w:start="0" w:end="0"/>
@@ -294,7 +288,6 @@
               <w:keepNext w:val="false"/>
               <w:keepLines w:val="false"/>
               <w:widowControl w:val="false"/>
-              <w:pBdr/>
               <w:shd w:val="clear" w:fill="auto"/>
               <w:spacing w:lineRule="auto" w:line="240" w:before="0" w:after="0"/>
               <w:ind w:hanging="0" w:start="0" w:end="0"/>
@@ -321,7 +314,7 @@
         </w:tc>
         <w:tc>
           <w:tcPr>
-            <w:tcW w:w="3091" w:type="dxa"/>
+            <w:tcW w:w="3092" w:type="dxa"/>
             <w:tcBorders>
               <w:top w:val="single" w:sz="8" w:space="0" w:color="000000"/>
               <w:start w:val="single" w:sz="8" w:space="0" w:color="FFFFFF"/>
@@ -336,7 +329,6 @@
               <w:keepNext w:val="false"/>
               <w:keepLines w:val="false"/>
               <w:widowControl w:val="false"/>
-              <w:pBdr/>
               <w:shd w:val="clear" w:fill="auto"/>
               <w:spacing w:lineRule="auto" w:line="240" w:before="0" w:after="0"/>
               <w:ind w:hanging="0" w:start="0" w:end="0"/>
@@ -362,7 +354,7 @@
         <w:trPr/>
         <w:tc>
           <w:tcPr>
-            <w:tcW w:w="1274" w:type="dxa"/>
+            <w:tcW w:w="1273" w:type="dxa"/>
             <w:tcBorders>
               <w:top w:val="single" w:sz="8" w:space="0" w:color="FFFFFF"/>
               <w:start w:val="single" w:sz="8" w:space="0" w:color="FFFFFF"/>
@@ -377,7 +369,6 @@
               <w:keepNext w:val="false"/>
               <w:keepLines w:val="false"/>
               <w:widowControl w:val="false"/>
-              <w:pBdr/>
               <w:shd w:val="clear" w:fill="auto"/>
               <w:spacing w:lineRule="auto" w:line="240" w:before="0" w:after="0"/>
               <w:ind w:hanging="0" w:start="0" w:end="0"/>
@@ -419,7 +410,6 @@
               <w:keepNext w:val="false"/>
               <w:keepLines w:val="false"/>
               <w:widowControl w:val="false"/>
-              <w:pBdr/>
               <w:shd w:val="clear" w:fill="auto"/>
               <w:spacing w:lineRule="auto" w:line="240" w:before="0" w:after="0"/>
               <w:ind w:hanging="0" w:start="0" w:end="0"/>
@@ -457,7 +447,6 @@
               <w:keepNext w:val="false"/>
               <w:keepLines w:val="false"/>
               <w:widowControl w:val="false"/>
-              <w:pBdr/>
               <w:shd w:val="clear" w:fill="auto"/>
               <w:spacing w:lineRule="auto" w:line="240" w:before="0" w:after="0"/>
               <w:ind w:hanging="0" w:start="0" w:end="0"/>
@@ -484,7 +473,7 @@
         </w:tc>
         <w:tc>
           <w:tcPr>
-            <w:tcW w:w="3091" w:type="dxa"/>
+            <w:tcW w:w="3092" w:type="dxa"/>
             <w:tcBorders>
               <w:top w:val="single" w:sz="8" w:space="0" w:color="000000"/>
               <w:start w:val="single" w:sz="8" w:space="0" w:color="FFFFFF"/>
@@ -499,7 +488,6 @@
               <w:keepNext w:val="false"/>
               <w:keepLines w:val="false"/>
               <w:widowControl w:val="false"/>
-              <w:pBdr/>
               <w:shd w:val="clear" w:fill="auto"/>
               <w:spacing w:lineRule="auto" w:line="240" w:before="0" w:after="0"/>
               <w:ind w:hanging="0" w:start="0" w:end="0"/>
@@ -583,7 +571,6 @@
               <w:keepNext w:val="false"/>
               <w:keepLines w:val="false"/>
               <w:widowControl w:val="false"/>
-              <w:pBdr/>
               <w:shd w:val="clear" w:fill="auto"/>
               <w:spacing w:lineRule="auto" w:line="240" w:before="0" w:after="0"/>
               <w:ind w:hanging="0" w:start="0" w:end="0"/>
@@ -627,7 +614,6 @@
               <w:keepNext w:val="false"/>
               <w:keepLines w:val="false"/>
               <w:widowControl w:val="false"/>
-              <w:pBdr/>
               <w:shd w:val="clear" w:fill="auto"/>
               <w:spacing w:lineRule="auto" w:line="240" w:before="0" w:after="0"/>
               <w:ind w:hanging="0" w:start="0" w:end="0"/>
@@ -671,7 +657,6 @@
               <w:keepNext w:val="false"/>
               <w:keepLines w:val="false"/>
               <w:widowControl w:val="false"/>
-              <w:pBdr/>
               <w:shd w:val="clear" w:fill="auto"/>
               <w:spacing w:lineRule="auto" w:line="240" w:before="0" w:after="0"/>
               <w:ind w:hanging="0" w:start="0" w:end="0"/>
@@ -766,7 +751,7 @@
                 <w:sz w:val="18"/>
                 <w:szCs w:val="18"/>
               </w:rPr>
-              <w:t>C.</w:t>
+              <w:t>C.230 y E.</w:t>
             </w:r>
             <w:r>
               <w:rPr>
@@ -774,46 +759,39 @@
                 <w:sz w:val="18"/>
                 <w:szCs w:val="18"/>
               </w:rPr>
-              <w:t>230</w:t>
-            </w:r>
+              <w:t>80</w:t>
+            </w:r>
+          </w:p>
+        </w:tc>
+        <w:tc>
+          <w:tcPr>
+            <w:tcW w:w="3010" w:type="dxa"/>
+            <w:tcBorders>
+              <w:top w:val="single" w:sz="8" w:space="0" w:color="000000"/>
+              <w:start w:val="single" w:sz="8" w:space="0" w:color="FFFFFF"/>
+              <w:bottom w:val="single" w:sz="8" w:space="0" w:color="000000"/>
+              <w:end w:val="single" w:sz="8" w:space="0" w:color="FFFFFF"/>
+            </w:tcBorders>
+            <w:shd w:fill="auto" w:val="clear"/>
+          </w:tcPr>
+          <w:p>
+            <w:pPr>
+              <w:pStyle w:val="normal1"/>
+              <w:widowControl w:val="false"/>
+              <w:spacing w:lineRule="auto" w:line="240"/>
+              <w:rPr>
+                <w:rFonts w:ascii="Consolas" w:hAnsi="Consolas" w:eastAsia="Consolas" w:cs="Consolas"/>
+                <w:sz w:val="18"/>
+                <w:szCs w:val="18"/>
+              </w:rPr>
+            </w:pPr>
             <w:r>
               <w:rPr>
                 <w:rFonts w:eastAsia="Consolas" w:cs="Consolas" w:ascii="Consolas" w:hAnsi="Consolas"/>
                 <w:sz w:val="18"/>
                 <w:szCs w:val="18"/>
               </w:rPr>
-              <w:t xml:space="preserve">               y E.120</w:t>
-            </w:r>
-          </w:p>
-        </w:tc>
-        <w:tc>
-          <w:tcPr>
-            <w:tcW w:w="3010" w:type="dxa"/>
-            <w:tcBorders>
-              <w:top w:val="single" w:sz="8" w:space="0" w:color="000000"/>
-              <w:start w:val="single" w:sz="8" w:space="0" w:color="FFFFFF"/>
-              <w:bottom w:val="single" w:sz="8" w:space="0" w:color="000000"/>
-              <w:end w:val="single" w:sz="8" w:space="0" w:color="FFFFFF"/>
-            </w:tcBorders>
-            <w:shd w:fill="auto" w:val="clear"/>
-          </w:tcPr>
-          <w:p>
-            <w:pPr>
-              <w:pStyle w:val="normal1"/>
-              <w:widowControl w:val="false"/>
-              <w:spacing w:lineRule="auto" w:line="240"/>
-              <w:rPr>
-                <w:rFonts w:ascii="Consolas" w:hAnsi="Consolas" w:eastAsia="Consolas" w:cs="Consolas"/>
-                <w:sz w:val="18"/>
-                <w:szCs w:val="18"/>
-              </w:rPr>
-            </w:pPr>
-            <w:r>
-              <w:rPr>
-                <w:rFonts w:eastAsia="Consolas" w:cs="Consolas" w:ascii="Consolas" w:hAnsi="Consolas"/>
-                <w:sz w:val="18"/>
-                <w:szCs w:val="18"/>
-              </w:rPr>
+              <w:t>C.193 y E.33</w:t>
             </w:r>
           </w:p>
         </w:tc>
@@ -885,7 +863,7 @@
                 <w:sz w:val="18"/>
                 <w:szCs w:val="18"/>
               </w:rPr>
-              <w:t xml:space="preserve">C. </w:t>
+              <w:t>C. 200 y E.</w:t>
             </w:r>
             <w:r>
               <w:rPr>
@@ -893,15 +871,7 @@
                 <w:sz w:val="18"/>
                 <w:szCs w:val="18"/>
               </w:rPr>
-              <w:t>200</w:t>
-            </w:r>
-            <w:r>
-              <w:rPr>
-                <w:rFonts w:eastAsia="Consolas" w:cs="Consolas" w:ascii="Consolas" w:hAnsi="Consolas"/>
-                <w:sz w:val="18"/>
-                <w:szCs w:val="18"/>
-              </w:rPr>
-              <w:t xml:space="preserve">                y E. 90</w:t>
+              <w:t>60</w:t>
             </w:r>
           </w:p>
         </w:tc>
@@ -1187,6 +1157,7 @@
                 <w:sz w:val="18"/>
                 <w:szCs w:val="18"/>
               </w:rPr>
+              <w:t>8 min</w:t>
             </w:r>
           </w:p>
         </w:tc>
@@ -1258,46 +1229,39 @@
                 <w:sz w:val="18"/>
                 <w:szCs w:val="18"/>
               </w:rPr>
-              <w:t xml:space="preserve">250 </w:t>
-            </w:r>
+              <w:t>250 min</w:t>
+            </w:r>
+          </w:p>
+        </w:tc>
+        <w:tc>
+          <w:tcPr>
+            <w:tcW w:w="3010" w:type="dxa"/>
+            <w:tcBorders>
+              <w:top w:val="single" w:sz="8" w:space="0" w:color="000000"/>
+              <w:start w:val="single" w:sz="8" w:space="0" w:color="FFFFFF"/>
+              <w:bottom w:val="single" w:sz="8" w:space="0" w:color="000000"/>
+              <w:end w:val="single" w:sz="8" w:space="0" w:color="FFFFFF"/>
+            </w:tcBorders>
+            <w:shd w:fill="auto" w:val="clear"/>
+          </w:tcPr>
+          <w:p>
+            <w:pPr>
+              <w:pStyle w:val="normal1"/>
+              <w:widowControl w:val="false"/>
+              <w:spacing w:lineRule="auto" w:line="240"/>
+              <w:rPr>
+                <w:rFonts w:ascii="Consolas" w:hAnsi="Consolas" w:eastAsia="Consolas" w:cs="Consolas"/>
+                <w:sz w:val="18"/>
+                <w:szCs w:val="18"/>
+              </w:rPr>
+            </w:pPr>
             <w:r>
               <w:rPr>
                 <w:rFonts w:eastAsia="Consolas" w:cs="Consolas" w:ascii="Consolas" w:hAnsi="Consolas"/>
                 <w:sz w:val="18"/>
                 <w:szCs w:val="18"/>
               </w:rPr>
-              <w:t>min</w:t>
-            </w:r>
-          </w:p>
-        </w:tc>
-        <w:tc>
-          <w:tcPr>
-            <w:tcW w:w="3010" w:type="dxa"/>
-            <w:tcBorders>
-              <w:top w:val="single" w:sz="8" w:space="0" w:color="000000"/>
-              <w:start w:val="single" w:sz="8" w:space="0" w:color="FFFFFF"/>
-              <w:bottom w:val="single" w:sz="8" w:space="0" w:color="000000"/>
-              <w:end w:val="single" w:sz="8" w:space="0" w:color="FFFFFF"/>
-            </w:tcBorders>
-            <w:shd w:fill="auto" w:val="clear"/>
-          </w:tcPr>
-          <w:p>
-            <w:pPr>
-              <w:pStyle w:val="normal1"/>
-              <w:widowControl w:val="false"/>
-              <w:spacing w:lineRule="auto" w:line="240"/>
-              <w:rPr>
-                <w:rFonts w:ascii="Consolas" w:hAnsi="Consolas" w:eastAsia="Consolas" w:cs="Consolas"/>
-                <w:sz w:val="18"/>
-                <w:szCs w:val="18"/>
-              </w:rPr>
-            </w:pPr>
-            <w:r>
-              <w:rPr>
-                <w:rFonts w:eastAsia="Consolas" w:cs="Consolas" w:ascii="Consolas" w:hAnsi="Consolas"/>
-                <w:sz w:val="18"/>
-                <w:szCs w:val="18"/>
-              </w:rPr>
+              <w:t>172 min</w:t>
             </w:r>
           </w:p>
         </w:tc>
@@ -1401,6 +1365,7 @@
                 <w:sz w:val="18"/>
                 <w:szCs w:val="18"/>
               </w:rPr>
+              <w:t>57 min</w:t>
             </w:r>
           </w:p>
         </w:tc>
@@ -1504,6 +1469,7 @@
                 <w:sz w:val="18"/>
                 <w:szCs w:val="18"/>
               </w:rPr>
+              <w:t>3 min</w:t>
             </w:r>
           </w:p>
         </w:tc>
@@ -1607,6 +1573,7 @@
                 <w:sz w:val="18"/>
                 <w:szCs w:val="18"/>
               </w:rPr>
+              <w:t>5 min</w:t>
             </w:r>
           </w:p>
         </w:tc>
@@ -1710,6 +1677,7 @@
                 <w:sz w:val="18"/>
                 <w:szCs w:val="18"/>
               </w:rPr>
+              <w:t>5 min</w:t>
             </w:r>
           </w:p>
         </w:tc>
@@ -1778,46 +1746,39 @@
                 <w:sz w:val="18"/>
                 <w:szCs w:val="18"/>
               </w:rPr>
-              <w:t xml:space="preserve">375 </w:t>
-            </w:r>
+              <w:t>375 min</w:t>
+            </w:r>
+          </w:p>
+        </w:tc>
+        <w:tc>
+          <w:tcPr>
+            <w:tcW w:w="3010" w:type="dxa"/>
+            <w:tcBorders>
+              <w:top w:val="single" w:sz="8" w:space="0" w:color="000000"/>
+              <w:start w:val="single" w:sz="8" w:space="0" w:color="FFFFFF"/>
+              <w:bottom w:val="single" w:sz="8" w:space="0" w:color="000000"/>
+              <w:end w:val="single" w:sz="8" w:space="0" w:color="FFFFFF"/>
+            </w:tcBorders>
+            <w:shd w:fill="auto" w:val="clear"/>
+          </w:tcPr>
+          <w:p>
+            <w:pPr>
+              <w:pStyle w:val="normal1"/>
+              <w:widowControl w:val="false"/>
+              <w:spacing w:lineRule="auto" w:line="240"/>
+              <w:rPr>
+                <w:rFonts w:ascii="Consolas" w:hAnsi="Consolas" w:eastAsia="Consolas" w:cs="Consolas"/>
+                <w:sz w:val="18"/>
+                <w:szCs w:val="18"/>
+              </w:rPr>
+            </w:pPr>
             <w:r>
               <w:rPr>
                 <w:rFonts w:eastAsia="Consolas" w:cs="Consolas" w:ascii="Consolas" w:hAnsi="Consolas"/>
                 <w:sz w:val="18"/>
                 <w:szCs w:val="18"/>
               </w:rPr>
-              <w:t>min</w:t>
-            </w:r>
-          </w:p>
-        </w:tc>
-        <w:tc>
-          <w:tcPr>
-            <w:tcW w:w="3010" w:type="dxa"/>
-            <w:tcBorders>
-              <w:top w:val="single" w:sz="8" w:space="0" w:color="000000"/>
-              <w:start w:val="single" w:sz="8" w:space="0" w:color="FFFFFF"/>
-              <w:bottom w:val="single" w:sz="8" w:space="0" w:color="000000"/>
-              <w:end w:val="single" w:sz="8" w:space="0" w:color="FFFFFF"/>
-            </w:tcBorders>
-            <w:shd w:fill="auto" w:val="clear"/>
-          </w:tcPr>
-          <w:p>
-            <w:pPr>
-              <w:pStyle w:val="normal1"/>
-              <w:widowControl w:val="false"/>
-              <w:spacing w:lineRule="auto" w:line="240"/>
-              <w:rPr>
-                <w:rFonts w:ascii="Consolas" w:hAnsi="Consolas" w:eastAsia="Consolas" w:cs="Consolas"/>
-                <w:sz w:val="18"/>
-                <w:szCs w:val="18"/>
-              </w:rPr>
-            </w:pPr>
-            <w:r>
-              <w:rPr>
-                <w:rFonts w:eastAsia="Consolas" w:cs="Consolas" w:ascii="Consolas" w:hAnsi="Consolas"/>
-                <w:sz w:val="18"/>
-                <w:szCs w:val="18"/>
-              </w:rPr>
+              <w:t>250 min</w:t>
             </w:r>
           </w:p>
         </w:tc>
@@ -3694,6 +3655,7 @@
     <w:qFormat/>
     <w:pPr>
       <w:widowControl/>
+      <w:suppressAutoHyphens w:val="true"/>
       <w:bidi w:val="0"/>
       <w:spacing w:lineRule="auto" w:line="276" w:before="0" w:after="0"/>
       <w:jc w:val="start"/>
@@ -3871,11 +3833,38 @@
       <w:rFonts w:cs="Noto Sans Devanagari"/>
     </w:rPr>
   </w:style>
+  <w:style w:type="paragraph" w:styleId="Ttulouser">
+    <w:name w:val="Título (user)"/>
+    <w:basedOn w:val="Normal"/>
+    <w:next w:val="BodyText"/>
+    <w:qFormat/>
+    <w:pPr>
+      <w:keepNext w:val="true"/>
+      <w:spacing w:before="240" w:after="120"/>
+    </w:pPr>
+    <w:rPr>
+      <w:rFonts w:ascii="Liberation Sans" w:hAnsi="Liberation Sans" w:eastAsia="Noto Sans CJK SC" w:cs="Noto Sans Devanagari"/>
+      <w:sz w:val="28"/>
+      <w:szCs w:val="28"/>
+    </w:rPr>
+  </w:style>
+  <w:style w:type="paragraph" w:styleId="ndiceuser">
+    <w:name w:val="Índice (user)"/>
+    <w:basedOn w:val="Normal"/>
+    <w:qFormat/>
+    <w:pPr>
+      <w:suppressLineNumbers/>
+    </w:pPr>
+    <w:rPr>
+      <w:rFonts w:cs="Noto Sans Devanagari"/>
+    </w:rPr>
+  </w:style>
   <w:style w:type="paragraph" w:styleId="normal1" w:default="1">
     <w:name w:val="normal1"/>
     <w:qFormat/>
     <w:pPr>
       <w:widowControl/>
+      <w:suppressAutoHyphens w:val="true"/>
       <w:bidi w:val="0"/>
       <w:spacing w:lineRule="auto" w:line="276" w:before="0" w:after="0"/>
       <w:jc w:val="start"/>

</xml_diff>